<commit_message>
Registra estado antes da revisão das citações
</commit_message>
<xml_diff>
--- a/_paginas_iniciais.docx
+++ b/_paginas_iniciais.docx
@@ -1304,13 +1304,18 @@
             </w:r>
             <w:r>
               <w:tab/>
-              <w:t xml:space="preserve">64</w:t>
+            </w:r>
+            <w:r>
+              <w:rPr>
+                <w:lang w:val="en-US"/>
+              </w:rPr>
+              <w:t xml:space="preserve">468</w:t>
             </w:r>
             <w:r>
               <w:rPr>
                 <w:color w:val="auto"/>
               </w:rPr>
-              <w:t xml:space="preserve">3 </w:t>
+              <w:t xml:space="preserve"> </w:t>
             </w:r>
             <w:r>
               <w:rPr>
@@ -1756,21 +1761,146 @@
         <w:pBdr/>
         <w:spacing w:after="80" w:before="280"/>
         <w:ind w:firstLine="0"/>
+        <w:rPr>
+          <w:highlight w:val="none"/>
+          <w:lang w:val="en-US"/>
+        </w:rPr>
+      </w:pPr>
+      <w:r>
+        <w:t xml:space="preserve">Data da Aprovação: </w:t>
+      </w:r>
+      <w:r>
+        <w:rPr>
+          <w:lang w:val="en-US"/>
+        </w:rPr>
+        <w:t xml:space="preserve">20</w:t>
+      </w:r>
+      <w:r>
+        <w:rPr>
+          <w:lang w:val="en-US"/>
+        </w:rPr>
+        <w:t xml:space="preserve"> </w:t>
+      </w:r>
+      <w:r>
+        <w:t xml:space="preserve">/</w:t>
+      </w:r>
+      <w:r>
+        <w:rPr>
+          <w:lang w:val="en-US"/>
+        </w:rPr>
+        <w:t xml:space="preserve">08</w:t>
+      </w:r>
+      <w:r>
+        <w:t xml:space="preserve">/</w:t>
+      </w:r>
+      <w:r>
+        <w:rPr>
+          <w:lang w:val="en-US"/>
+        </w:rPr>
+        <w:t xml:space="preserve">2026</w:t>
+      </w:r>
+      <w:r/>
+    </w:p>
+    <w:p>
+      <w:pPr>
+        <w:pBdr/>
+        <w:spacing w:after="80" w:before="280"/>
+        <w:ind w:firstLine="0"/>
         <w:rPr/>
       </w:pPr>
+      <w:r>
+        <w:rPr>
+          <w:highlight w:val="none"/>
+          <w:lang w:val="en-US"/>
+        </w:rPr>
+      </w:r>
+      <w:r>
+        <w:rPr>
+          <w:highlight w:val="none"/>
+          <w:lang w:val="en-US"/>
+        </w:rPr>
+      </w:r>
+      <w:r>
+        <w:rPr>
+          <w:highlight w:val="none"/>
+          <w:lang w:val="en-US"/>
+        </w:rPr>
+      </w:r>
+    </w:p>
+    <w:p>
+      <w:pPr>
+        <w:pBdr/>
+        <w:shd w:val="clear" w:color="auto" w:fill="ffffff"/>
+        <w:spacing w:after="0"/>
+        <w:ind w:firstLine="0"/>
+        <w:rPr>
+          <w:highlight w:val="none"/>
+          <w:lang w:val="en-US"/>
+        </w:rPr>
+      </w:pPr>
+      <w:r>
+        <w:rPr>
+          <w:lang w:val="en-US"/>
+        </w:rPr>
+        <w:t xml:space="preserve">Orientadora</w:t>
+      </w:r>
+      <w:r/>
+    </w:p>
+    <w:p>
+      <w:pPr>
+        <w:pBdr/>
+        <w:shd w:val="clear" w:color="auto" w:fill="ffffff"/>
+        <w:spacing w:after="0"/>
+        <w:ind w:firstLine="0"/>
+        <w:rPr/>
+      </w:pPr>
+      <w:r/>
       <w:r/>
       <w:r/>
     </w:p>
     <w:p>
       <w:pPr>
         <w:pBdr/>
-        <w:spacing w:after="80" w:before="280"/>
-        <w:ind w:firstLine="0"/>
+        <w:shd w:val="clear" w:color="auto" w:fill="ffffff"/>
+        <w:spacing w:after="0"/>
+        <w:ind w:hanging="8"/>
+        <w:jc w:val="center"/>
         <w:rPr/>
       </w:pPr>
       <w:r>
-        <w:t xml:space="preserve">Data da Aprovação: ____ / _____ / ____________</w:t>
+        <w:t xml:space="preserve">___________________________________________________</w:t>
       </w:r>
+      <w:r/>
+      <w:r/>
+    </w:p>
+    <w:p>
+      <w:pPr>
+        <w:pBdr/>
+        <w:shd w:val="clear" w:color="auto" w:fill="ffffff"/>
+        <w:spacing w:after="0"/>
+        <w:ind w:hanging="8"/>
+        <w:jc w:val="center"/>
+        <w:rPr/>
+      </w:pPr>
+      <w:r>
+        <w:t xml:space="preserve">Prof. D</w:t>
+      </w:r>
+      <w:r>
+        <w:t xml:space="preserve">rª</w:t>
+      </w:r>
+      <w:r>
+        <w:t xml:space="preserve">.</w:t>
+      </w:r>
+      <w:r>
+        <w:rPr>
+          <w:lang w:val="en-US"/>
+        </w:rPr>
+        <w:t xml:space="preserve"> </w:t>
+      </w:r>
+      <w:r>
+        <w:t xml:space="preserve">Welere Gomes Barbosa, UFT</w:t>
+      </w:r>
+      <w:r/>
       <w:r/>
     </w:p>
     <w:p>
@@ -1781,8 +1911,24 @@
         <w:ind w:firstLine="0"/>
         <w:rPr/>
       </w:pPr>
-      <w:r/>
-      <w:r/>
+      <w:r>
+        <w:rPr>
+          <w:highlight w:val="none"/>
+          <w:lang w:val="en-US"/>
+        </w:rPr>
+      </w:r>
+      <w:r>
+        <w:rPr>
+          <w:highlight w:val="none"/>
+          <w:lang w:val="en-US"/>
+        </w:rPr>
+      </w:r>
+      <w:r>
+        <w:rPr>
+          <w:highlight w:val="none"/>
+          <w:lang w:val="en-US"/>
+        </w:rPr>
+      </w:r>
     </w:p>
     <w:p>
       <w:pPr>
@@ -1834,6 +1980,19 @@
       <w:r>
         <w:t xml:space="preserve">Prof. Dr. Heber Rogério Grácio, UFT </w:t>
       </w:r>
+      <w:r/>
+    </w:p>
+    <w:p>
+      <w:pPr>
+        <w:pBdr/>
+        <w:shd w:val="clear" w:color="auto" w:fill="ffffff"/>
+        <w:spacing w:after="0"/>
+        <w:ind w:hanging="8"/>
+        <w:jc w:val="center"/>
+        <w:rPr/>
+      </w:pPr>
+      <w:r/>
+      <w:r/>
       <w:r/>
     </w:p>
     <w:p>
@@ -1929,31 +2088,12 @@
     <w:p>
       <w:pPr>
         <w:pBdr/>
-        <w:shd w:val="clear" w:color="auto" w:fill="ffffff" w:themeFill="background1"/>
-        <w:spacing w:after="0"/>
-        <w:ind w:hanging="8"/>
-        <w:jc w:val="center"/>
-        <w:rPr/>
-      </w:pPr>
-      <w:r/>
-      <w:r/>
-    </w:p>
-    <w:p>
-      <w:pPr>
-        <w:pBdr/>
         <w:spacing/>
         <w:ind/>
         <w:rPr>
           <w:b/>
         </w:rPr>
       </w:pPr>
-      <w:r>
-        <w:rPr>
-          <w:b/>
-          <w:bCs/>
-        </w:rPr>
-        <w:br w:type="page" w:clear="all"/>
-      </w:r>
       <w:r>
         <w:rPr>
           <w:b/>

</xml_diff>

<commit_message>
Atualiza ficha e resumo da dissertação
</commit_message>
<xml_diff>
--- a/_paginas_iniciais.docx
+++ b/_paginas_iniciais.docx
@@ -1799,7 +1799,12 @@
         </w:rPr>
         <w:t xml:space="preserve">2026</w:t>
       </w:r>
-      <w:r/>
+      <w:r>
+        <w:rPr>
+          <w:highlight w:val="none"/>
+          <w:lang w:val="en-US"/>
+        </w:rPr>
+      </w:r>
     </w:p>
     <w:p>
       <w:pPr>
@@ -1820,6 +1825,25 @@
           <w:lang w:val="en-US"/>
         </w:rPr>
       </w:r>
+      <w:r/>
+    </w:p>
+    <w:p>
+      <w:pPr>
+        <w:pBdr/>
+        <w:shd w:val="clear" w:color="auto" w:fill="ffffff"/>
+        <w:spacing w:after="0"/>
+        <w:ind w:firstLine="0"/>
+        <w:rPr>
+          <w:highlight w:val="none"/>
+          <w:lang w:val="en-US"/>
+        </w:rPr>
+      </w:pPr>
+      <w:r>
+        <w:rPr>
+          <w:lang w:val="en-US"/>
+        </w:rPr>
+        <w:t xml:space="preserve">Orientadora</w:t>
+      </w:r>
       <w:r>
         <w:rPr>
           <w:highlight w:val="none"/>
@@ -1833,28 +1857,8 @@
         <w:shd w:val="clear" w:color="auto" w:fill="ffffff"/>
         <w:spacing w:after="0"/>
         <w:ind w:firstLine="0"/>
-        <w:rPr>
-          <w:highlight w:val="none"/>
-          <w:lang w:val="en-US"/>
-        </w:rPr>
-      </w:pPr>
-      <w:r>
-        <w:rPr>
-          <w:lang w:val="en-US"/>
-        </w:rPr>
-        <w:t xml:space="preserve">Orientadora</w:t>
-      </w:r>
-      <w:r/>
-    </w:p>
-    <w:p>
-      <w:pPr>
-        <w:pBdr/>
-        <w:shd w:val="clear" w:color="auto" w:fill="ffffff"/>
-        <w:spacing w:after="0"/>
-        <w:ind w:firstLine="0"/>
         <w:rPr/>
       </w:pPr>
-      <w:r/>
       <w:r/>
       <w:r/>
     </w:p>
@@ -1870,7 +1874,6 @@
       <w:r>
         <w:t xml:space="preserve">___________________________________________________</w:t>
       </w:r>
-      <w:r/>
       <w:r/>
     </w:p>
     <w:p>
@@ -1901,7 +1904,6 @@
         <w:t xml:space="preserve">Welere Gomes Barbosa, UFT</w:t>
       </w:r>
       <w:r/>
-      <w:r/>
     </w:p>
     <w:p>
       <w:pPr>
@@ -1923,12 +1925,7 @@
           <w:lang w:val="en-US"/>
         </w:rPr>
       </w:r>
-      <w:r>
-        <w:rPr>
-          <w:highlight w:val="none"/>
-          <w:lang w:val="en-US"/>
-        </w:rPr>
-      </w:r>
+      <w:r/>
     </w:p>
     <w:p>
       <w:pPr>
@@ -1991,7 +1988,6 @@
         <w:jc w:val="center"/>
         <w:rPr/>
       </w:pPr>
-      <w:r/>
       <w:r/>
       <w:r/>
     </w:p>
@@ -2094,6 +2090,11 @@
           <w:b/>
         </w:rPr>
       </w:pPr>
+      <w:r>
+        <w:rPr>
+          <w:b/>
+        </w:rPr>
+      </w:r>
       <w:r>
         <w:rPr>
           <w:b/>
@@ -3378,115 +3379,86 @@
         <w:rPr>
           <w:color w:val="000000" w:themeColor="text1"/>
         </w:rPr>
-        <w:t xml:space="preserve">Este estudo propõe-se a analisar em que medida as recomendações formuladas pelo Departamento Nacional de Auditoria do SUS (DENASUS) apresentam caráter transformador e indutor de soluções de longo prazo, contribuindo, a</w:t>
       </w:r>
       <w:r>
         <w:rPr>
           <w:color w:val="000000" w:themeColor="text1"/>
         </w:rPr>
-        <w:t xml:space="preserve">ssim, para a reestruturação do Sistema Único de Saúde (SUS) e para o fortalecimento da governança pública na área da saúde. Para tanto, busca-se aprofundar a compreensão sobre o papel institucional do DENASUS por meio da análise do conteúdo das recomendaçõ</w:t>
+        <w:t xml:space="preserve">Este estudo propõe-se a analisar em que medida as recomendações formuladas pelo Departamento Nacional de Auditoria do SUS (DENASUS) se orientam à correção das condições observadas ou ao enfrentamento das causas dos problemas identificados, discutindo seu po</w:t>
       </w:r>
       <w:r>
         <w:rPr>
           <w:color w:val="000000" w:themeColor="text1"/>
         </w:rPr>
-        <w:t xml:space="preserve">es de auditoria por ele emitidas, investigando se tais recomendações expressam uma orientação à transformação estrutural do SUS ou se se limitam à correção de falhas administrativas pontuais. Adota-se, como referencial analítico, a tipologia proposta pelo </w:t>
+        <w:t xml:space="preserve">tencial de contribuição para processos de aperfeiçoamento institucional e para o fortalecimento da governança pública na área da saúde. Para tanto, busca aprofundar a compreensão sobre o papel institucional do DENASUS por meio da análise do conteúdo das rec</w:t>
       </w:r>
       <w:r>
         <w:rPr>
           <w:color w:val="000000" w:themeColor="text1"/>
         </w:rPr>
-        <w:t xml:space="preserve">Institute</w:t>
+        <w:t xml:space="preserve">omendações de auditoria por ele emitidas, examinando se as diferentes orientações presentes nas medidas propostas expressam uma orientação à transformação estrutural do SUS ou se se limitam a correção de falhas administrativas pontuais. Adota-se, como refer</w:t>
       </w:r>
       <w:r>
         <w:rPr>
           <w:color w:val="000000" w:themeColor="text1"/>
         </w:rPr>
-        <w:t xml:space="preserve"> </w:t>
+        <w:t xml:space="preserve">encial analítico, a tipologia proposta pelo </w:t>
+      </w:r>
+      <w:r>
+        <w:rPr>
+          <w:i/>
+          <w:iCs/>
+          <w:color w:val="000000" w:themeColor="text1"/>
+        </w:rPr>
+        <w:t xml:space="preserve">Institute of Internal Auditors</w:t>
       </w:r>
       <w:r>
         <w:rPr>
           <w:color w:val="000000" w:themeColor="text1"/>
         </w:rPr>
-        <w:t xml:space="preserve">of</w:t>
+        <w:t xml:space="preserve"> (IIA), que diferencia recomendações voltadas às causas dos problemas identificados daquelas centradas na condição observada. A pesquisa emprega uma abordagem metodológica híbrida, </w:t>
       </w:r>
       <w:r>
         <w:rPr>
           <w:color w:val="000000" w:themeColor="text1"/>
         </w:rPr>
-        <w:t xml:space="preserve"> </w:t>
+        <w:t xml:space="preserve">na qual um modelo de linguagem de grande escala (LLM) foi utilizado como instrumento de apoio ao exame do conteúdo das recomendações, contemplando tanto a codificação automatizada quanto a posterior análise crítica das classificações produzidas. A supervisã</w:t>
       </w:r>
       <w:r>
         <w:rPr>
           <w:color w:val="000000" w:themeColor="text1"/>
         </w:rPr>
-        <w:t xml:space="preserve">Internal</w:t>
+        <w:t xml:space="preserve">o da pesquisadora orientou a definição dos parâmetros, o desenvolvimento e refinamento do protocolo e a interpretação dos resultados, sem que a concordância entre as etapas automatizadas fosse tomada como forma de validação independente. Os achados evidenci</w:t>
       </w:r>
       <w:r>
         <w:rPr>
           <w:color w:val="000000" w:themeColor="text1"/>
         </w:rPr>
-        <w:t xml:space="preserve"> </w:t>
+        <w:t xml:space="preserve">am a coexistência de orientações distintas e potencialmente complementares: uma parcela expressiva das recomendações apresenta características associadas ao enfrentamento das causas dos problemas, enquanto outra se dirige à correção de não conformidades ope</w:t>
       </w:r>
       <w:r>
         <w:rPr>
           <w:color w:val="000000" w:themeColor="text1"/>
         </w:rPr>
-        <w:t xml:space="preserve">Auditors</w:t>
+        <w:t xml:space="preserve">racionais, à recomposição da conformidade e à resposta a demandas mais imediatas. A análise crítica revelou, contudo, maior instabilidade na avaliação dos efeitos duradouros, recomendando cautela quanto à afirmação de uma predominância inequívoca de uma des</w:t>
       </w:r>
       <w:r>
         <w:rPr>
           <w:color w:val="000000" w:themeColor="text1"/>
         </w:rPr>
-        <w:t xml:space="preserve"> </w:t>
+        <w:t xml:space="preserve">sas orientações. À luz dos referenciais do institucionalismo e do neo-institucionalismo, os resultados permitem compreender a atividade recomendatória do DENASUS como articuladora de funções de correção, estabilização e aperfeiçoamento, algumas das quais ap</w:t>
       </w:r>
       <w:r>
         <w:rPr>
           <w:color w:val="000000" w:themeColor="text1"/>
         </w:rPr>
-        <w:t xml:space="preserve">(IIA), que diferencia recomendações voltadas à causa dos problemas identificados daquelas centradas apenas na</w:t>
+        <w:t xml:space="preserve">resentam potencial para favorecer processos graduais de mudança institucional. A dissertação contribui para o debate sobre o papel da auditoria governamental na qualificação das políticas públicas de saúde, ao evidenciar as diferentes formas pelas quais sua</w:t>
       </w:r>
       <w:r>
         <w:rPr>
           <w:color w:val="000000" w:themeColor="text1"/>
         </w:rPr>
-        <w:t xml:space="preserve"> condição observada. A pesquisa emprega uma abordagem metodológica híbrida, combinando o uso de técnicas de inteligência artificial na codificação das recomendações com a mediação crítica humana na análise e interpretação dos dados. Os resultados evidencia</w:t>
-      </w:r>
-      <w:r>
-        <w:rPr>
-          <w:color w:val="000000" w:themeColor="text1"/>
-        </w:rPr>
-        <w:t xml:space="preserve">m a coexistência de duas lógicas de atuação, com predominância de recomendações orientadas às causas dos problemas identificados, o que sugere uma atuação institucional que privilegia o aperfeiçoamento estrutural do sistema. Paralelamente, observa-se a pre</w:t>
-      </w:r>
-      <w:r>
-        <w:rPr>
-          <w:color w:val="000000" w:themeColor="text1"/>
-        </w:rPr>
-        <w:t xml:space="preserve">sença significativa de recomendações direcionadas à correção de não conformidades operacionais, indicando a atuação do órgão também na estabilização de processos e na resposta a demandas imediatas. À luz dos referenciais do institucionalismo clássico e do </w:t>
-      </w:r>
-      <w:r>
-        <w:rPr>
-          <w:color w:val="000000" w:themeColor="text1"/>
-        </w:rPr>
-        <w:t xml:space="preserve">neo-institucionalismo</w:t>
-      </w:r>
-      <w:r>
-        <w:rPr>
-          <w:color w:val="000000" w:themeColor="text1"/>
-        </w:rPr>
-        <w:t xml:space="preserve">, conclui-se que tais recomend</w:t>
-      </w:r>
-      <w:r>
-        <w:rPr>
-          <w:color w:val="000000" w:themeColor="text1"/>
-        </w:rPr>
-        <w:t xml:space="preserve">ações operam simultaneamente como mecanismos de estabilização institucional e como vetores de mudança incremental, evidenciando o caráter dinâmico da atuação do DENASUS. A dissertação contribui para o debate sobre o papel da auditoria governamental na qual</w:t>
-      </w:r>
-      <w:r>
-        <w:rPr>
-          <w:color w:val="000000" w:themeColor="text1"/>
-        </w:rPr>
-        <w:t xml:space="preserve">ificação das políticas públicas de saúde, ao evidenciar seu potencial de atuar não apenas como instrumento de controle, mas como indutor de aperfeiçoamento institucional, oferecendo subsídios analíticos para o fortalecimento da governança no setor público.</w:t>
+        <w:t xml:space="preserve">s recomendações podem orientar a gestão e oferecer subsídios analíticos para o fortalecimento da governança no setor público.</w:t>
       </w:r>
       <w:r>
         <w:rPr>
@@ -3526,13 +3498,7 @@
         <w:rPr>
           <w:color w:val="000000" w:themeColor="text1"/>
         </w:rPr>
-        <w:t xml:space="preserve">Auditoria </w:t>
-      </w:r>
-      <w:r>
-        <w:rPr>
-          <w:color w:val="000000" w:themeColor="text1"/>
-        </w:rPr>
-        <w:t xml:space="preserve">governamental. DENASUS. Sistema Único de Saúde. Transformação institucional.</w:t>
+        <w:t xml:space="preserve">Auditoria governamental. DENASUS. Sistema Único de Saúde. Mudança institucional.</w:t>
       </w:r>
       <w:r>
         <w:rPr>
@@ -3636,91 +3602,99 @@
           <w:color w:val="000000" w:themeColor="text1"/>
           <w:lang w:val="en-US"/>
         </w:rPr>
-        <w:t xml:space="preserve">This study aims to analyze the </w:t>
       </w:r>
       <w:r>
         <w:rPr>
           <w:color w:val="000000" w:themeColor="text1"/>
           <w:lang w:val="en-US"/>
         </w:rPr>
-        <w:t xml:space="preserve">extent </w:t>
+        <w:t xml:space="preserve">This study aims to analyze the extent to which the recommendations issued by the Brazilian National Audit Department of the Unified Health System (DENASUS) are oriented toward correcting observed conditions or addressing the causes of identified problems, w</w:t>
       </w:r>
       <w:r>
         <w:rPr>
           <w:color w:val="000000" w:themeColor="text1"/>
           <w:lang w:val="en-US"/>
         </w:rPr>
-        <w:t xml:space="preserve">to which the recommendations issued by the National Depar</w:t>
+        <w:t xml:space="preserve">hile discussing their potential contribution to processes of institutional improvement and to strengthening public governance in the health sector. To this end, it seeks to deepen the understanding of DENASUS’s institutional role through content analysis of</w:t>
       </w:r>
       <w:r>
         <w:rPr>
           <w:color w:val="000000" w:themeColor="text1"/>
           <w:lang w:val="en-US"/>
         </w:rPr>
-        <w:t xml:space="preserve">tment of Audit of the Unified Health System (DENASUS) exhibit a transformative character and foster long-term solutions, thereby contributing to the restructuring of the Unified Health System (SUS) and to the strengthening of public governance in the healt</w:t>
+        <w:t xml:space="preserve"> the audit recommendations it issues, examining whether the different orientations reflected in the proposed measures point toward structural transformation within the Unified Health System (SUS) or remain limited to the correction of specific administrativ</w:t>
       </w:r>
       <w:r>
         <w:rPr>
           <w:color w:val="000000" w:themeColor="text1"/>
           <w:lang w:val="en-US"/>
         </w:rPr>
-        <w:t xml:space="preserve">h sector. To this end, it seeks to deepen the understanding of the institutional role of DENASUS through the analysis of the content of its audit recommendations, investigating whether such recommendations are oriented toward structural transformation of t</w:t>
+        <w:t xml:space="preserve">e shortcomings. The analytical framework adopted is the typology proposed by the </w:t>
+      </w:r>
+      <w:r>
+        <w:rPr>
+          <w:i/>
+          <w:iCs/>
+          <w:color w:val="000000" w:themeColor="text1"/>
+          <w:lang w:val="en-US"/>
+        </w:rPr>
+        <w:t xml:space="preserve">Institute of Internal Auditors</w:t>
       </w:r>
       <w:r>
         <w:rPr>
           <w:color w:val="000000" w:themeColor="text1"/>
           <w:lang w:val="en-US"/>
         </w:rPr>
-        <w:t xml:space="preserve">he SUS or are limited to the correction of specific administrative failures. The analytical framework is based on the typology proposed by the Institute of Internal Auditors (IIA), which distinguishes between recommendations focused on the root causes of i</w:t>
+        <w:t xml:space="preserve"> (IIA), which distinguishes recommendations aimed at the causes of identified problems from those centered on the observed condition. The resear</w:t>
       </w:r>
       <w:r>
         <w:rPr>
           <w:color w:val="000000" w:themeColor="text1"/>
           <w:lang w:val="en-US"/>
         </w:rPr>
-        <w:t xml:space="preserve">dentified problems and those centered solely on the observed condition. The study adopts a hybrid methodological approach, combining the use of artificial intelligence techniques for the coding of recommendations with critical human mediation in data analy</w:t>
+        <w:t xml:space="preserve">ch employs a hybrid methodological approach in which a large language model (LLM) was used as a supporting instrument for examining the content of the recommendations, encompassing both automated coding and the subsequent critical analysis of the classifica</w:t>
       </w:r>
       <w:r>
         <w:rPr>
           <w:color w:val="000000" w:themeColor="text1"/>
           <w:lang w:val="en-US"/>
         </w:rPr>
-        <w:t xml:space="preserve">sis and interpretation. The results reveal the coexistence of two operational logics, with a predominance of recommendations oriented toward addressing the underlying causes of identified problems, suggesting an institutional performance that prioritizes t</w:t>
+        <w:t xml:space="preserve">tions produced. Researcher supervision guided parameter definition, protocol development and refinement, and the interpretation of results, without treating agreement between automated stages as a form of independent validation. The findings reveal the coex</w:t>
       </w:r>
       <w:r>
         <w:rPr>
           <w:color w:val="000000" w:themeColor="text1"/>
           <w:lang w:val="en-US"/>
         </w:rPr>
-        <w:t xml:space="preserve">he structural improvement of the system. At the same time, a significant presence of recommendations aimed at correcting operational nonconformities is observed, indicating the agency’s role in process stabilization and in responding to immediate demands. </w:t>
+        <w:t xml:space="preserve">istence of distinct and potentially complementary orientations: a substantial share of the recommendations displays characteristics associated with addressing the causes of problems, while another share is directed toward correcting operational nonconformit</w:t>
       </w:r>
       <w:r>
         <w:rPr>
           <w:color w:val="000000" w:themeColor="text1"/>
           <w:lang w:val="en-US"/>
         </w:rPr>
-        <w:t xml:space="preserve">In light of</w:t>
+        <w:t xml:space="preserve">ies, restoring compliance, and responding to more immediate demands. The critical analysis, however, revealed greater instability in the assessment of lasting effects, warranting caution in asserting the unequivocal predominance of either orientation. In li</w:t>
       </w:r>
       <w:r>
         <w:rPr>
           <w:color w:val="000000" w:themeColor="text1"/>
           <w:lang w:val="en-US"/>
         </w:rPr>
-        <w:t xml:space="preserve"> the theoretical frameworks of classical institutionalism and neo-institutionalism, it is concluded </w:t>
+        <w:t xml:space="preserve">ght of institutionalist and neo-institutionalist perspectives, the results make it possible to understand DENASUS’s recommendation activity as combining functions of correction, stabilization, and improvement, some of which have the potential to foster grad</w:t>
       </w:r>
       <w:r>
         <w:rPr>
           <w:color w:val="000000" w:themeColor="text1"/>
           <w:lang w:val="en-US"/>
         </w:rPr>
-        <w:t xml:space="preserve">that such recommendations operate simultaneously as mechanisms of institutional stabilization and as drivers of incremental change, highlighting the dynamic nature of DENASUS’s role within SUS governance. The dissertation contributes to the debate on the r</w:t>
+        <w:t xml:space="preserve">ual processes of institutional change. The dissertation contributes to the debate on the role of government auditing in improving public health policies by highlighting the different ways in which audit recommendations may guide management practices and by </w:t>
       </w:r>
       <w:r>
         <w:rPr>
           <w:color w:val="000000" w:themeColor="text1"/>
           <w:lang w:val="en-US"/>
         </w:rPr>
-        <w:t xml:space="preserve">ole of governmental auditing in enhancing public health policies, demonstrating its potential not only as a control mechanism but also as a driver of institutional improvement, providing analytical support for strengthening governance in the public sector.</w:t>
+        <w:t xml:space="preserve">offering analytical inputs for strengthening governance in the public sector.</w:t>
       </w:r>
       <w:r>
         <w:rPr>
@@ -3766,35 +3740,19 @@
           <w:color w:val="000000" w:themeColor="text1"/>
           <w:lang w:val="en-US"/>
         </w:rPr>
-        <w:t xml:space="preserve"> Governmental auditing. DENASUS. Brazilian Unified Health System. </w:t>
-      </w:r>
-      <w:r>
-        <w:rPr>
-          <w:color w:val="000000" w:themeColor="text1"/>
-        </w:rPr>
-        <w:t xml:space="preserve">Institutional</w:t>
-      </w:r>
-      <w:r>
-        <w:rPr>
-          <w:color w:val="000000" w:themeColor="text1"/>
-        </w:rPr>
         <w:t xml:space="preserve"> </w:t>
       </w:r>
       <w:r>
         <w:rPr>
           <w:color w:val="000000" w:themeColor="text1"/>
+          <w:lang w:val="en-US"/>
         </w:rPr>
-        <w:t xml:space="preserve">transformation</w:t>
+        <w:t xml:space="preserve">Government auditing. DENASUS. Unified Health System. Institutional change.</w:t>
       </w:r>
       <w:r>
         <w:rPr>
           <w:color w:val="000000" w:themeColor="text1"/>
-        </w:rPr>
-        <w:t xml:space="preserve">.</w:t>
-      </w:r>
-      <w:r>
-        <w:rPr>
-          <w:color w:val="000000" w:themeColor="text1"/>
+          <w:lang w:val="en-US"/>
         </w:rPr>
       </w:r>
       <w:r>

</xml_diff>

<commit_message>
Aplica ajustes da dissertação III
</commit_message>
<xml_diff>
--- a/_paginas_iniciais.docx
+++ b/_paginas_iniciais.docx
@@ -1258,10 +1258,6 @@
               </w:rPr>
             </w:pPr>
             <w:r>
-              <w:t xml:space="preserve">  </w:t>
-            </w:r>
-            <w:r>
-              <w:tab/>
               <w:t xml:space="preserve">CAUSA </w:t>
             </w:r>
             <w:r>
@@ -1300,16 +1296,10 @@
               </w:rPr>
             </w:pPr>
             <w:r>
-              <w:t xml:space="preserve">  </w:t>
-            </w:r>
-            <w:r>
-              <w:tab/>
-            </w:r>
-            <w:r>
               <w:rPr>
                 <w:lang w:val="en-US"/>
               </w:rPr>
-              <w:t xml:space="preserve">468</w:t>
+              <w:t xml:space="preserve">467</w:t>
             </w:r>
             <w:r>
               <w:rPr>
@@ -1347,10 +1337,6 @@
               </w:rPr>
             </w:pPr>
             <w:r>
-              <w:t xml:space="preserve"> </w:t>
-            </w:r>
-            <w:r>
-              <w:tab/>
               <w:t xml:space="preserve">Dissertação (Mestrado Profissional) - Universidade Federal do Tocantins – Câmpus Universitário de Palmas </w:t>
             </w:r>
             <w:r>
@@ -1380,11 +1366,13 @@
               <w:rPr/>
             </w:pPr>
             <w:r>
-              <w:t xml:space="preserve"> </w:t>
+              <w:rPr>
+                <w:lang w:val="en-US"/>
+              </w:rPr>
+              <w:t xml:space="preserve">O</w:t>
             </w:r>
             <w:r>
-              <w:tab/>
-              <w:t xml:space="preserve">Orientadora: </w:t>
+              <w:t xml:space="preserve">rientadora: </w:t>
             </w:r>
             <w:r>
               <w:t xml:space="preserve">Profª</w:t>
@@ -1416,15 +1404,16 @@
               </w:rPr>
             </w:pPr>
             <w:r>
+              <w:t xml:space="preserve">1. Auditoria</w:t>
+            </w:r>
+            <w:r>
+              <w:rPr>
+                <w:lang w:val="en-US"/>
+              </w:rPr>
               <w:t xml:space="preserve"> </w:t>
             </w:r>
             <w:r>
-              <w:tab/>
-              <w:t xml:space="preserve">1. Auditoria</w:t>
-            </w:r>
-            <w:r>
-              <w:tab/>
-              <w:t xml:space="preserve">governamental. 2. DENASUS. 3. Políticas públicas de saúde. 4.  Recomendações de auditoria. 5. Causa subjacente e condição observada. I. Título</w:t>
+              <w:t xml:space="preserve">governamental. 2. DENASUS. 3. Políticas públicas de saúde. 4.  Recomendações de auditoria. 5. Causa subjacente e condição observada.</w:t>
             </w:r>
             <w:r>
               <w:rPr>
@@ -1805,6 +1794,12 @@
           <w:lang w:val="en-US"/>
         </w:rPr>
       </w:r>
+      <w:r>
+        <w:rPr>
+          <w:highlight w:val="none"/>
+          <w:lang w:val="en-US"/>
+        </w:rPr>
+      </w:r>
     </w:p>
     <w:p>
       <w:pPr>
@@ -1843,6 +1838,12 @@
           <w:lang w:val="en-US"/>
         </w:rPr>
         <w:t xml:space="preserve">Orientadora</w:t>
+      </w:r>
+      <w:r>
+        <w:rPr>
+          <w:highlight w:val="none"/>
+          <w:lang w:val="en-US"/>
+        </w:rPr>
       </w:r>
       <w:r>
         <w:rPr>
@@ -3384,19 +3385,37 @@
         <w:rPr>
           <w:color w:val="000000" w:themeColor="text1"/>
         </w:rPr>
-        <w:t xml:space="preserve">Este estudo propõe-se a analisar em que medida as recomendações formuladas pelo Departamento Nacional de Auditoria do SUS (DENASUS) se orientam à correção das condições observadas ou ao enfrentamento das causas dos problemas identificados, discutindo seu po</w:t>
+        <w:t xml:space="preserve">E</w:t>
       </w:r>
       <w:r>
         <w:rPr>
           <w:color w:val="000000" w:themeColor="text1"/>
         </w:rPr>
-        <w:t xml:space="preserve">tencial de contribuição para processos de aperfeiçoamento institucional e para o fortalecimento da governança pública na área da saúde. Para tanto, busca aprofundar a compreensão sobre o papel institucional do DENASUS por meio da análise do conteúdo das rec</w:t>
+        <w:t xml:space="preserve">ste estudo propõe-se a analisar em que medida as recomendações formuladas pelo Departamento Nacional de Auditoria do SUS (DENASUS) se orientam à correção das condições observadas ou ao enfrentamento das causas dos problemas identificados, discutindo seu po</w:t>
       </w:r>
       <w:r>
         <w:rPr>
           <w:color w:val="000000" w:themeColor="text1"/>
         </w:rPr>
-        <w:t xml:space="preserve">omendações de auditoria por ele emitidas, examinando se as diferentes orientações presentes nas medidas propostas expressam uma orientação à transformação estrutural do SUS ou se se limitam a correção de falhas administrativas pontuais. Adota-se, como refer</w:t>
+        <w:t xml:space="preserve">t</w:t>
+      </w:r>
+      <w:r>
+        <w:rPr>
+          <w:color w:val="000000" w:themeColor="text1"/>
+        </w:rPr>
+        <w:t xml:space="preserve">encial de contribuição para processos de aperfeiçoamento institucional e para o fortalecimento da governança pública na área da saúde. Para tanto, busca aprofundar a compreensão sobre o papel institucional do DENASUS por meio da análise do conteúdo das rec</w:t>
+      </w:r>
+      <w:r>
+        <w:rPr>
+          <w:color w:val="000000" w:themeColor="text1"/>
+        </w:rPr>
+        <w:t xml:space="preserve">o</w:t>
+      </w:r>
+      <w:r>
+        <w:rPr>
+          <w:color w:val="000000" w:themeColor="text1"/>
+        </w:rPr>
+        <w:t xml:space="preserve">mendações de auditoria por ele emitidas, examinando se as diferentes orientações presentes nas medidas propostas expressam uma orientação à transformação estrutural do SUS ou se se limitam a correção de falhas administrativas pontuais. Adota-se, como refer</w:t>
       </w:r>
       <w:r>
         <w:rPr>
@@ -3422,37 +3441,73 @@
         <w:rPr>
           <w:color w:val="000000" w:themeColor="text1"/>
         </w:rPr>
-        <w:t xml:space="preserve">na qual um modelo de linguagem de grande escala (LLM) foi utilizado como instrumento de apoio ao exame do conteúdo das recomendações, contemplando tanto a codificação automatizada quanto a posterior análise crítica das classificações produzidas. A supervisã</w:t>
+        <w:t xml:space="preserve">n</w:t>
       </w:r>
       <w:r>
         <w:rPr>
           <w:color w:val="000000" w:themeColor="text1"/>
         </w:rPr>
-        <w:t xml:space="preserve">o da pesquisadora orientou a definição dos parâmetros, o desenvolvimento e refinamento do protocolo e a interpretação dos resultados, sem que a concordância entre as etapas automatizadas fosse tomada como forma de validação independente. Os achados evidenci</w:t>
+        <w:t xml:space="preserve">a qual um modelo de linguagem de grande escala (LLM) foi utilizado como instrumento de apoio ao exame do conteúdo das recomendações, contemplando tanto a codificação automatizada quanto a posterior análise crítica das classificações produzidas. A supervisã</w:t>
       </w:r>
       <w:r>
         <w:rPr>
           <w:color w:val="000000" w:themeColor="text1"/>
         </w:rPr>
-        <w:t xml:space="preserve">am a coexistência de orientações distintas e potencialmente complementares: uma parcela expressiva das recomendações apresenta características associadas ao enfrentamento das causas dos problemas, enquanto outra se dirige à correção de não conformidades ope</w:t>
+        <w:t xml:space="preserve">o</w:t>
       </w:r>
       <w:r>
         <w:rPr>
           <w:color w:val="000000" w:themeColor="text1"/>
         </w:rPr>
-        <w:t xml:space="preserve">racionais, à recomposição da conformidade e à resposta a demandas mais imediatas. A análise crítica revelou, contudo, maior instabilidade na avaliação dos efeitos duradouros, recomendando cautela quanto à afirmação de uma predominância inequívoca de uma des</w:t>
+        <w:t xml:space="preserve"> da pesquisadora orientou a definição dos parâmetros, o desenvolvimento e refinamento do protocolo e a interpretação dos resultados, sem que a concordância entre as etapas automatizadas fosse tomada como forma de validação independente. Os achados evidenci</w:t>
       </w:r>
       <w:r>
         <w:rPr>
           <w:color w:val="000000" w:themeColor="text1"/>
         </w:rPr>
-        <w:t xml:space="preserve">sas orientações. À luz dos referenciais do institucionalismo e do neo-institucionalismo, os resultados permitem compreender a atividade recomendatória do DENASUS como articuladora de funções de correção, estabilização e aperfeiçoamento, algumas das quais ap</w:t>
+        <w:t xml:space="preserve">a</w:t>
       </w:r>
       <w:r>
         <w:rPr>
           <w:color w:val="000000" w:themeColor="text1"/>
         </w:rPr>
-        <w:t xml:space="preserve">resentam potencial para favorecer processos graduais de mudança institucional. A dissertação contribui para o debate sobre o papel da auditoria governamental na qualificação das políticas públicas de saúde, ao evidenciar as diferentes formas pelas quais sua</w:t>
+        <w:t xml:space="preserve">m a coexistência de orientações distintas e potencialmente complementares: uma parcela expressiva das recomendações apresenta características associadas ao enfrentamento das causas dos problemas, enquanto outra se dirige à correção de não conformidades ope</w:t>
+      </w:r>
+      <w:r>
+        <w:rPr>
+          <w:color w:val="000000" w:themeColor="text1"/>
+        </w:rPr>
+        <w:t xml:space="preserve">r</w:t>
+      </w:r>
+      <w:r>
+        <w:rPr>
+          <w:color w:val="000000" w:themeColor="text1"/>
+        </w:rPr>
+        <w:t xml:space="preserve">acionais, à recomposição da conformidade e à resposta a demandas mais imediatas. A análise crítica revelou, contudo, maior instabilidade na avaliação dos efeitos duradouros, recomendando cautela quanto à afirmação de uma predominância inequívoca de uma des</w:t>
+      </w:r>
+      <w:r>
+        <w:rPr>
+          <w:color w:val="000000" w:themeColor="text1"/>
+        </w:rPr>
+        <w:t xml:space="preserve">s</w:t>
+      </w:r>
+      <w:r>
+        <w:rPr>
+          <w:color w:val="000000" w:themeColor="text1"/>
+        </w:rPr>
+        <w:t xml:space="preserve">as orientações. À luz dos referenciais do institucionalismo e do neo-institucionalismo, os resultados permitem compreender a atividade recomendatória do DENASUS como articuladora de funções de correção, estabilização e aperfeiçoamento, algumas das quais ap</w:t>
+      </w:r>
+      <w:r>
+        <w:rPr>
+          <w:color w:val="000000" w:themeColor="text1"/>
+        </w:rPr>
+        <w:t xml:space="preserve">r</w:t>
+      </w:r>
+      <w:r>
+        <w:rPr>
+          <w:color w:val="000000" w:themeColor="text1"/>
+        </w:rPr>
+        <w:t xml:space="preserve">esentam potencial para favorecer processos graduais de mudança institucional. A dissertação contribui para o debate sobre o papel da auditoria governamental na qualificação das políticas públicas de saúde, ao evidenciar as diferentes formas pelas quais sua</w:t>
       </w:r>
       <w:r>
         <w:rPr>
@@ -3608,21 +3663,42 @@
           <w:color w:val="000000" w:themeColor="text1"/>
           <w:lang w:val="en-US"/>
         </w:rPr>
-        <w:t xml:space="preserve">This study aims to analyze the extent to which the recommendations issued by the Brazilian National Audit Department of the Unified Health System (DENASUS) are oriented toward correcting observed conditions or addressing the causes of identified problems, w</w:t>
+        <w:t xml:space="preserve">T</w:t>
       </w:r>
       <w:r>
         <w:rPr>
           <w:color w:val="000000" w:themeColor="text1"/>
           <w:lang w:val="en-US"/>
         </w:rPr>
-        <w:t xml:space="preserve">hile discussing their potential contribution to processes of institutional improvement and to strengthening public governance in the health sector. To this end, it seeks to deepen the understanding of DENASUS’s institutional role through content analysis of</w:t>
+        <w:t xml:space="preserve">his study aims to analyze the extent to which the recommendations issued by the Brazilian National Audit Department of the Unified Health System (DENASUS) are oriented toward correcting observed conditions or addressing the causes of identified problems, w</w:t>
       </w:r>
       <w:r>
         <w:rPr>
           <w:color w:val="000000" w:themeColor="text1"/>
           <w:lang w:val="en-US"/>
         </w:rPr>
-        <w:t xml:space="preserve"> the audit recommendations it issues, examining whether the different orientations reflected in the proposed measures point toward structural transformation within the Unified Health System (SUS) or remain limited to the correction of specific administrativ</w:t>
+        <w:t xml:space="preserve">h</w:t>
+      </w:r>
+      <w:r>
+        <w:rPr>
+          <w:color w:val="000000" w:themeColor="text1"/>
+          <w:lang w:val="en-US"/>
+        </w:rPr>
+        <w:t xml:space="preserve">ile discussing their potential contribution to processes of institutional improvement and to strengthening public governance in the health sector. To this end, it seeks to deepen the understanding of DENASUS’s institutional role through content analysis of</w:t>
+      </w:r>
+      <w:r>
+        <w:rPr>
+          <w:color w:val="000000" w:themeColor="text1"/>
+          <w:lang w:val="en-US"/>
+        </w:rPr>
+        <w:t xml:space="preserve"> </w:t>
+      </w:r>
+      <w:r>
+        <w:rPr>
+          <w:color w:val="000000" w:themeColor="text1"/>
+          <w:lang w:val="en-US"/>
+        </w:rPr>
+        <w:t xml:space="preserve">the audit recommendations it issues, examining whether the different orientations reflected in the proposed measures point toward structural transformation within the Unified Health System (SUS) or remain limited to the correction of specific administrativ</w:t>
       </w:r>
       <w:r>
         <w:rPr>
@@ -3652,42 +3728,84 @@
           <w:color w:val="000000" w:themeColor="text1"/>
           <w:lang w:val="en-US"/>
         </w:rPr>
-        <w:t xml:space="preserve">ch employs a hybrid methodological approach in which a large language model (LLM) was used as a supporting instrument for examining the content of the recommendations, encompassing both automated coding and the subsequent critical analysis of the classifica</w:t>
+        <w:t xml:space="preserve">c</w:t>
       </w:r>
       <w:r>
         <w:rPr>
           <w:color w:val="000000" w:themeColor="text1"/>
           <w:lang w:val="en-US"/>
         </w:rPr>
-        <w:t xml:space="preserve">tions produced. Researcher supervision guided parameter definition, protocol development and refinement, and the interpretation of results, without treating agreement between automated stages as a form of independent validation. The findings reveal the coex</w:t>
+        <w:t xml:space="preserve">h employs a hybrid methodological approach in which a large language model (LLM) was used as a supporting instrument for examining the content of the recommendations, encompassing both automated coding and the subsequent critical analysis of the classifica</w:t>
       </w:r>
       <w:r>
         <w:rPr>
           <w:color w:val="000000" w:themeColor="text1"/>
           <w:lang w:val="en-US"/>
         </w:rPr>
-        <w:t xml:space="preserve">istence of distinct and potentially complementary orientations: a substantial share of the recommendations displays characteristics associated with addressing the causes of problems, while another share is directed toward correcting operational nonconformit</w:t>
+        <w:t xml:space="preserve">t</w:t>
       </w:r>
       <w:r>
         <w:rPr>
           <w:color w:val="000000" w:themeColor="text1"/>
           <w:lang w:val="en-US"/>
         </w:rPr>
-        <w:t xml:space="preserve">ies, restoring compliance, and responding to more immediate demands. The critical analysis, however, revealed greater instability in the assessment of lasting effects, warranting caution in asserting the unequivocal predominance of either orientation. In li</w:t>
+        <w:t xml:space="preserve">ions produced. Researcher supervision guided parameter definition, protocol development and refinement, and the interpretation of results, without treating agreement between automated stages as a form of independent validation. The findings reveal the coex</w:t>
       </w:r>
       <w:r>
         <w:rPr>
           <w:color w:val="000000" w:themeColor="text1"/>
           <w:lang w:val="en-US"/>
         </w:rPr>
-        <w:t xml:space="preserve">ght of institutionalist and neo-institutionalist perspectives, the results make it possible to understand DENASUS’s recommendation activity as combining functions of correction, stabilization, and improvement, some of which have the potential to foster grad</w:t>
+        <w:t xml:space="preserve">i</w:t>
       </w:r>
       <w:r>
         <w:rPr>
           <w:color w:val="000000" w:themeColor="text1"/>
           <w:lang w:val="en-US"/>
         </w:rPr>
-        <w:t xml:space="preserve">ual processes of institutional change. The dissertation contributes to the debate on the role of government auditing in improving public health policies by highlighting the different ways in which audit recommendations may guide management practices and by </w:t>
+        <w:t xml:space="preserve">stence of distinct and potentially complementary orientations: a substantial share of the recommendations displays characteristics associated with addressing the causes of problems, while another share is directed toward correcting operational nonconformit</w:t>
+      </w:r>
+      <w:r>
+        <w:rPr>
+          <w:color w:val="000000" w:themeColor="text1"/>
+          <w:lang w:val="en-US"/>
+        </w:rPr>
+        <w:t xml:space="preserve">i</w:t>
+      </w:r>
+      <w:r>
+        <w:rPr>
+          <w:color w:val="000000" w:themeColor="text1"/>
+          <w:lang w:val="en-US"/>
+        </w:rPr>
+        <w:t xml:space="preserve">es, restoring compliance, and responding to more immediate demands. The critical analysis, however, revealed greater instability in the assessment of lasting effects, warranting caution in asserting the unequivocal predominance of either orientation. In li</w:t>
+      </w:r>
+      <w:r>
+        <w:rPr>
+          <w:color w:val="000000" w:themeColor="text1"/>
+          <w:lang w:val="en-US"/>
+        </w:rPr>
+        <w:t xml:space="preserve">g</w:t>
+      </w:r>
+      <w:r>
+        <w:rPr>
+          <w:color w:val="000000" w:themeColor="text1"/>
+          <w:lang w:val="en-US"/>
+        </w:rPr>
+        <w:t xml:space="preserve">ht of institutionalist and neo-institutionalist perspectives, the results make it possible to understand DENASUS’s recommendation activity as combining functions of correction, stabilization, and improvement, some of which have the potential to foster grad</w:t>
+      </w:r>
+      <w:r>
+        <w:rPr>
+          <w:color w:val="000000" w:themeColor="text1"/>
+          <w:lang w:val="en-US"/>
+        </w:rPr>
+        <w:t xml:space="preserve">u</w:t>
+      </w:r>
+      <w:r>
+        <w:rPr>
+          <w:color w:val="000000" w:themeColor="text1"/>
+          <w:lang w:val="en-US"/>
+        </w:rPr>
+        <w:t xml:space="preserve">al processes of institutional change. The dissertation contributes to the debate on the role of government auditing in improving public health policies by highlighting the different ways in which audit recommendations may guide management practices and by </w:t>
       </w:r>
       <w:r>
         <w:rPr>
@@ -3752,7 +3870,6 @@
       <w:r>
         <w:rPr>
           <w:color w:val="000000" w:themeColor="text1"/>
-          <w:lang w:val="en-US"/>
         </w:rPr>
       </w:r>
       <w:r>

</xml_diff>

<commit_message>
Ajusta notas de gráficos e resumos iniciais
</commit_message>
<xml_diff>
--- a/_paginas_iniciais.docx
+++ b/_paginas_iniciais.docx
@@ -3385,135 +3385,152 @@
         <w:rPr>
           <w:color w:val="000000" w:themeColor="text1"/>
         </w:rPr>
-        <w:t xml:space="preserve">E</w:t>
       </w:r>
       <w:r>
         <w:rPr>
-          <w:color w:val="000000" w:themeColor="text1"/>
+          <w:rFonts w:ascii="Cambria" w:hAnsi="Cambria" w:eastAsia="Cambria" w:cs="Cambria"/>
+          <w:color w:val="000000"/>
+          <w:sz w:val="22"/>
+          <w:u w:val="none"/>
         </w:rPr>
-        <w:t xml:space="preserve">ste estudo propõe-se a analisar em que medida as recomendações formuladas pelo Departamento Nacional de Auditoria do SUS (DENASUS) se orientam à correção das condições observadas ou ao enfrentamento das causas dos problemas identificados, discutindo seu po</w:t>
+        <w:t xml:space="preserve">Este estudo analisa em que medida as recomendações formuladas pelo Departamento Nacional de Auditoria do SUS (DENASUS) se orientam à correção das condições observadas ou ao enfrentamento das causas dos problemas identificados e discute o que essas diferent</w:t>
       </w:r>
       <w:r>
         <w:rPr>
-          <w:color w:val="000000" w:themeColor="text1"/>
+          <w:rFonts w:ascii="Cambria" w:hAnsi="Cambria" w:eastAsia="Cambria" w:cs="Cambria"/>
+          <w:color w:val="000000"/>
+          <w:sz w:val="22"/>
+          <w:u w:val="none"/>
         </w:rPr>
-        <w:t xml:space="preserve">t</w:t>
+        <w:t xml:space="preserve">es orientações permitem inferir sobre seu potencial de contribuição para processos de aperfeiçoamento institucional no Sistema Único de Saúde (SUS). Adota-se, como referencial analítico, a tipologia difundida pelo Institute of Internal Auditors (IIA) e inc</w:t>
       </w:r>
       <w:r>
         <w:rPr>
-          <w:color w:val="000000" w:themeColor="text1"/>
+          <w:rFonts w:ascii="Cambria" w:hAnsi="Cambria" w:eastAsia="Cambria" w:cs="Cambria"/>
+          <w:color w:val="000000"/>
+          <w:sz w:val="22"/>
+          <w:u w:val="none"/>
         </w:rPr>
-        <w:t xml:space="preserve">encial de contribuição para processos de aperfeiçoamento institucional e para o fortalecimento da governança pública na área da saúde. Para tanto, busca aprofundar a compreensão sobre o papel institucional do DENASUS por meio da análise do conteúdo das rec</w:t>
+        <w:t xml:space="preserve">orporada às orientações da Controladoria-Geral da União (CGU), que distingue recomendações centradas na condição observada (</w:t>
       </w:r>
       <w:r>
         <w:rPr>
-          <w:color w:val="000000" w:themeColor="text1"/>
+          <w:rFonts w:ascii="Cambria" w:hAnsi="Cambria" w:eastAsia="Cambria" w:cs="Cambria"/>
+          <w:i/>
+          <w:color w:val="000000"/>
+          <w:sz w:val="22"/>
+          <w:u w:val="none"/>
         </w:rPr>
-        <w:t xml:space="preserve">o</w:t>
+        <w:t xml:space="preserve">condition-based</w:t>
       </w:r>
       <w:r>
         <w:rPr>
-          <w:color w:val="000000" w:themeColor="text1"/>
+          <w:rFonts w:ascii="Cambria" w:hAnsi="Cambria" w:eastAsia="Cambria" w:cs="Cambria"/>
+          <w:color w:val="000000"/>
+          <w:sz w:val="22"/>
+          <w:u w:val="none"/>
         </w:rPr>
-        <w:t xml:space="preserve">mendações de auditoria por ele emitidas, examinando se as diferentes orientações presentes nas medidas propostas expressam uma orientação à transformação estrutural do SUS ou se se limitam a correção de falhas administrativas pontuais. Adota-se, como refer</w:t>
+        <w:t xml:space="preserve">) daquelas voltadas à causa subjacente do problema (</w:t>
       </w:r>
       <w:r>
         <w:rPr>
-          <w:color w:val="000000" w:themeColor="text1"/>
+          <w:rFonts w:ascii="Cambria" w:hAnsi="Cambria" w:eastAsia="Cambria" w:cs="Cambria"/>
+          <w:i/>
+          <w:color w:val="000000"/>
+          <w:sz w:val="22"/>
+          <w:u w:val="none"/>
         </w:rPr>
-        <w:t xml:space="preserve">encial analítico, a tipologia proposta pelo </w:t>
+        <w:t xml:space="preserve">cause-based</w:t>
       </w:r>
       <w:r>
         <w:rPr>
-          <w:i/>
-          <w:iCs/>
-          <w:color w:val="000000" w:themeColor="text1"/>
+          <w:rFonts w:ascii="Cambria" w:hAnsi="Cambria" w:eastAsia="Cambria" w:cs="Cambria"/>
+          <w:color w:val="000000"/>
+          <w:sz w:val="22"/>
+          <w:u w:val="none"/>
         </w:rPr>
-        <w:t xml:space="preserve">Institute of Internal Auditors</w:t>
+        <w:t xml:space="preserve">). O corpus compreendeu 4.289 recomendações extraídas dos relatórios de auditoria selecionados segundo o período de encerramento compreendido entre 01/01/2023 e 31/07/2025. A pesquisa empregou análise de conteúdo apoiada por modelos de linguagem de grande </w:t>
       </w:r>
       <w:r>
         <w:rPr>
-          <w:color w:val="000000" w:themeColor="text1"/>
+          <w:rFonts w:ascii="Cambria" w:hAnsi="Cambria" w:eastAsia="Cambria" w:cs="Cambria"/>
+          <w:color w:val="000000"/>
+          <w:sz w:val="22"/>
+          <w:u w:val="none"/>
         </w:rPr>
-        <w:t xml:space="preserve"> (IIA), que diferencia recomendações voltadas às causas dos problemas identificados daquelas centradas na condição observada. A pesquisa emprega uma abordagem metodológica híbrida, </w:t>
+        <w:t xml:space="preserve">escala (LLMs), articulando a codificação automatizada das recomendações a uma posterior análise crítica das classificações produzidas, sob supervisão da pesquisadora na definição dos parâmetros, no desenvolvimento e refinamento do protocolo e na interpreta</w:t>
       </w:r>
       <w:r>
         <w:rPr>
-          <w:color w:val="000000" w:themeColor="text1"/>
+          <w:rFonts w:ascii="Cambria" w:hAnsi="Cambria" w:eastAsia="Cambria" w:cs="Cambria"/>
+          <w:color w:val="000000"/>
+          <w:sz w:val="22"/>
+          <w:u w:val="none"/>
         </w:rPr>
-        <w:t xml:space="preserve">n</w:t>
+        <w:t xml:space="preserve">ção dos resultados. Complementarmente, as não convergências relativas ao critério “efeitos duradouros” foram submetidas a categorização orientada pelo acervo. Na codificação definitiva, 62,28% das recomendações foram classificadas simultaneamente com foco </w:t>
       </w:r>
       <w:r>
         <w:rPr>
-          <w:color w:val="000000" w:themeColor="text1"/>
+          <w:rFonts w:ascii="Cambria" w:hAnsi="Cambria" w:eastAsia="Cambria" w:cs="Cambria"/>
+          <w:color w:val="000000"/>
+          <w:sz w:val="22"/>
+          <w:u w:val="none"/>
         </w:rPr>
-        <w:t xml:space="preserve">a qual um modelo de linguagem de grande escala (LLM) foi utilizado como instrumento de apoio ao exame do conteúdo das recomendações, contemplando tanto a codificação automatizada quanto a posterior análise crítica das classificações produzidas. A supervisã</w:t>
+        <w:t xml:space="preserve">na causa e efeitos duradouros, enquanto parcela expressiva do corpus permaneceu sem foco causal identificado. A análise crítica, contudo, revelou maior estabilidade na identificação do foco na causa do que na avaliação dos efeitos duradouros, recomendando </w:t>
       </w:r>
       <w:r>
         <w:rPr>
-          <w:color w:val="000000" w:themeColor="text1"/>
+          <w:rFonts w:ascii="Cambria" w:hAnsi="Cambria" w:eastAsia="Cambria" w:cs="Cambria"/>
+          <w:color w:val="000000"/>
+          <w:sz w:val="22"/>
+          <w:u w:val="none"/>
         </w:rPr>
-        <w:t xml:space="preserve">o</w:t>
+        <w:t xml:space="preserve">cautela quanto à afirmação de uma predominância inequívoca de uma dessas orientações. O aprofundamento qualitativo das não convergências mostrou que a instabilidade relativa aos efeitos duradouros estava associada, sobretudo, à dependência de execução cont</w:t>
       </w:r>
       <w:r>
         <w:rPr>
-          <w:color w:val="000000" w:themeColor="text1"/>
+          <w:rFonts w:ascii="Cambria" w:hAnsi="Cambria" w:eastAsia="Cambria" w:cs="Cambria"/>
+          <w:color w:val="000000"/>
+          <w:sz w:val="22"/>
+          <w:u w:val="none"/>
         </w:rPr>
-        <w:t xml:space="preserve"> da pesquisadora orientou a definição dos parâmetros, o desenvolvimento e refinamento do protocolo e a interpretação dos resultados, sem que a concordância entre as etapas automatizadas fosse tomada como forma de validação independente. Os achados evidenci</w:t>
+        <w:t xml:space="preserve">inuada e à reunião de ações de alcances distintos em uma mesma recomendação. Os resultados evidenciam, assim, um repertório recomendatório heterogêneo, no qual medidas voltadas à correção e à estabilização convivem com intervenções orientadas às causas dos</w:t>
       </w:r>
       <w:r>
         <w:rPr>
-          <w:color w:val="000000" w:themeColor="text1"/>
+          <w:rFonts w:ascii="Cambria" w:hAnsi="Cambria" w:eastAsia="Cambria" w:cs="Cambria"/>
+          <w:color w:val="000000"/>
+          <w:sz w:val="22"/>
+          <w:u w:val="none"/>
         </w:rPr>
-        <w:t xml:space="preserve">a</w:t>
+        <w:t xml:space="preserve"> problemas e potencialmente capazes de favorecer processos graduais de aperfeiçoamento institucional. À luz do institucionalismo e do neo-institucionalismo, essas orientações são compreendidas como potencialmente complementares, sem que o conteúdo document</w:t>
       </w:r>
       <w:r>
         <w:rPr>
-          <w:color w:val="000000" w:themeColor="text1"/>
+          <w:rFonts w:ascii="Cambria" w:hAnsi="Cambria" w:eastAsia="Cambria" w:cs="Cambria"/>
+          <w:color w:val="000000"/>
+          <w:sz w:val="22"/>
+          <w:u w:val="none"/>
         </w:rPr>
-        <w:t xml:space="preserve">m a coexistência de orientações distintas e potencialmente complementares: uma parcela expressiva das recomendações apresenta características associadas ao enfrentamento das causas dos problemas, enquanto outra se dirige à correção de não conformidades ope</w:t>
+        <w:t xml:space="preserve">al permita afirmar a implementação das medidas ou a ocorrência efetiva de mudanças institucionais. A dissertação contribui para o debate sobre a auditoria governamental em saúde ao oferecer bases empíricas, analíticas e metodológicas para compreender as di</w:t>
       </w:r>
       <w:r>
         <w:rPr>
-          <w:color w:val="000000" w:themeColor="text1"/>
+          <w:rFonts w:ascii="Cambria" w:hAnsi="Cambria" w:eastAsia="Cambria" w:cs="Cambria"/>
+          <w:color w:val="000000"/>
+          <w:sz w:val="22"/>
+          <w:u w:val="none"/>
         </w:rPr>
-        <w:t xml:space="preserve">r</w:t>
+        <w:t xml:space="preserve">ferentes orientações presentes nas recomendações do DENASUS, examinar a utilidade da tipologia causa/condição e explorar o emprego de modelos de linguagem na análise de conteúdo em larga escala, qualificando a reflexão sobre o papel da atividade auditorial</w:t>
       </w:r>
       <w:r>
         <w:rPr>
-          <w:color w:val="000000" w:themeColor="text1"/>
+          <w:rFonts w:ascii="Cambria" w:hAnsi="Cambria" w:eastAsia="Cambria" w:cs="Cambria"/>
+          <w:color w:val="000000"/>
+          <w:sz w:val="22"/>
+          <w:u w:val="none"/>
         </w:rPr>
-        <w:t xml:space="preserve">acionais, à recomposição da conformidade e à resposta a demandas mais imediatas. A análise crítica revelou, contudo, maior instabilidade na avaliação dos efeitos duradouros, recomendando cautela quanto à afirmação de uma predominância inequívoca de uma des</w:t>
-      </w:r>
-      <w:r>
-        <w:rPr>
-          <w:color w:val="000000" w:themeColor="text1"/>
-        </w:rPr>
-        <w:t xml:space="preserve">s</w:t>
-      </w:r>
-      <w:r>
-        <w:rPr>
-          <w:color w:val="000000" w:themeColor="text1"/>
-        </w:rPr>
-        <w:t xml:space="preserve">as orientações. À luz dos referenciais do institucionalismo e do neo-institucionalismo, os resultados permitem compreender a atividade recomendatória do DENASUS como articuladora de funções de correção, estabilização e aperfeiçoamento, algumas das quais ap</w:t>
-      </w:r>
-      <w:r>
-        <w:rPr>
-          <w:color w:val="000000" w:themeColor="text1"/>
-        </w:rPr>
-        <w:t xml:space="preserve">r</w:t>
-      </w:r>
-      <w:r>
-        <w:rPr>
-          <w:color w:val="000000" w:themeColor="text1"/>
-        </w:rPr>
-        <w:t xml:space="preserve">esentam potencial para favorecer processos graduais de mudança institucional. A dissertação contribui para o debate sobre o papel da auditoria governamental na qualificação das políticas públicas de saúde, ao evidenciar as diferentes formas pelas quais sua</w:t>
-      </w:r>
-      <w:r>
-        <w:rPr>
-          <w:color w:val="000000" w:themeColor="text1"/>
-        </w:rPr>
-        <w:t xml:space="preserve">s recomendações podem orientar a gestão e oferecer subsídios analíticos para o fortalecimento da governança no setor público.</w:t>
+        <w:t xml:space="preserve"> na governança do SUS. </w:t>
       </w:r>
       <w:r>
         <w:rPr>
@@ -3553,7 +3570,15 @@
         <w:rPr>
           <w:color w:val="000000" w:themeColor="text1"/>
         </w:rPr>
-        <w:t xml:space="preserve">Auditoria governamental. DENASUS. Sistema Único de Saúde. Mudança institucional.</w:t>
+      </w:r>
+      <w:r>
+        <w:rPr>
+          <w:rFonts w:ascii="Cambria" w:hAnsi="Cambria" w:eastAsia="Cambria" w:cs="Cambria"/>
+          <w:color w:val="000000"/>
+          <w:sz w:val="22"/>
+          <w:u w:val="none"/>
+        </w:rPr>
+        <w:t xml:space="preserve">auditoria governamental; DENASUS; Sistema Único de Saúde; mudança institucional. </w:t>
       </w:r>
       <w:r>
         <w:rPr>
@@ -3663,156 +3688,143 @@
           <w:color w:val="000000" w:themeColor="text1"/>
           <w:lang w:val="en-US"/>
         </w:rPr>
-        <w:t xml:space="preserve">T</w:t>
       </w:r>
       <w:r>
         <w:rPr>
-          <w:color w:val="000000" w:themeColor="text1"/>
-          <w:lang w:val="en-US"/>
+          <w:rFonts w:ascii="Cambria" w:hAnsi="Cambria" w:eastAsia="Cambria" w:cs="Cambria"/>
+          <w:color w:val="000000"/>
+          <w:sz w:val="22"/>
+          <w:u w:val="none"/>
         </w:rPr>
-        <w:t xml:space="preserve">his study aims to analyze the extent to which the recommendations issued by the Brazilian National Audit Department of the Unified Health System (DENASUS) are oriented toward correcting observed conditions or addressing the causes of identified problems, w</w:t>
+        <w:t xml:space="preserve">This study examines the extent to which recommendations issued by the Brazilian National Audit Department of the Unified Health System (DENASUS) are oriented toward correcting observed conditions or addressing the causes of identified problems, and discuss</w:t>
       </w:r>
       <w:r>
         <w:rPr>
-          <w:color w:val="000000" w:themeColor="text1"/>
-          <w:lang w:val="en-US"/>
+          <w:rFonts w:ascii="Cambria" w:hAnsi="Cambria" w:eastAsia="Cambria" w:cs="Cambria"/>
+          <w:color w:val="000000"/>
+          <w:sz w:val="22"/>
+          <w:u w:val="none"/>
         </w:rPr>
-        <w:t xml:space="preserve">h</w:t>
+        <w:t xml:space="preserve">es what these different orientations allow one to infer about their potential contribution to processes of institutional improvement within the Unified Health System (SUS). The analytical framework is based on the typology disseminated by the Institute of </w:t>
       </w:r>
       <w:r>
         <w:rPr>
-          <w:color w:val="000000" w:themeColor="text1"/>
-          <w:lang w:val="en-US"/>
+          <w:rFonts w:ascii="Cambria" w:hAnsi="Cambria" w:eastAsia="Cambria" w:cs="Cambria"/>
+          <w:color w:val="000000"/>
+          <w:sz w:val="22"/>
+          <w:u w:val="none"/>
         </w:rPr>
-        <w:t xml:space="preserve">ile discussing their potential contribution to processes of institutional improvement and to strengthening public governance in the health sector. To this end, it seeks to deepen the understanding of DENASUS’s institutional role through content analysis of</w:t>
+        <w:t xml:space="preserve">Internal Auditors (IIA) and incorporated into the guidelines of the Brazilian Office of the Comptroller General (CGU), which distinguishes recommendations centered on the observed condition (</w:t>
       </w:r>
       <w:r>
         <w:rPr>
-          <w:color w:val="000000" w:themeColor="text1"/>
-          <w:lang w:val="en-US"/>
+          <w:rFonts w:ascii="Cambria" w:hAnsi="Cambria" w:eastAsia="Cambria" w:cs="Cambria"/>
+          <w:i/>
+          <w:color w:val="000000"/>
+          <w:sz w:val="22"/>
+          <w:u w:val="none"/>
         </w:rPr>
-        <w:t xml:space="preserve"> </w:t>
+        <w:t xml:space="preserve">condition-based</w:t>
       </w:r>
       <w:r>
         <w:rPr>
-          <w:color w:val="000000" w:themeColor="text1"/>
-          <w:lang w:val="en-US"/>
+          <w:rFonts w:ascii="Cambria" w:hAnsi="Cambria" w:eastAsia="Cambria" w:cs="Cambria"/>
+          <w:color w:val="000000"/>
+          <w:sz w:val="22"/>
+          <w:u w:val="none"/>
         </w:rPr>
-        <w:t xml:space="preserve">the audit recommendations it issues, examining whether the different orientations reflected in the proposed measures point toward structural transformation within the Unified Health System (SUS) or remain limited to the correction of specific administrativ</w:t>
+        <w:t xml:space="preserve">) from those directed at the underlying cause of the problem (</w:t>
       </w:r>
       <w:r>
         <w:rPr>
-          <w:color w:val="000000" w:themeColor="text1"/>
-          <w:lang w:val="en-US"/>
+          <w:rFonts w:ascii="Cambria" w:hAnsi="Cambria" w:eastAsia="Cambria" w:cs="Cambria"/>
+          <w:i/>
+          <w:color w:val="000000"/>
+          <w:sz w:val="22"/>
+          <w:u w:val="none"/>
         </w:rPr>
-        <w:t xml:space="preserve">e shortcomings. The analytical framework adopted is the typology proposed by the </w:t>
+        <w:t xml:space="preserve">cause-based</w:t>
       </w:r>
       <w:r>
         <w:rPr>
-          <w:i/>
-          <w:iCs/>
-          <w:color w:val="000000" w:themeColor="text1"/>
-          <w:lang w:val="en-US"/>
+          <w:rFonts w:ascii="Cambria" w:hAnsi="Cambria" w:eastAsia="Cambria" w:cs="Cambria"/>
+          <w:color w:val="000000"/>
+          <w:sz w:val="22"/>
+          <w:u w:val="none"/>
         </w:rPr>
-        <w:t xml:space="preserve">Institute of Internal Auditors</w:t>
+        <w:t xml:space="preserve">). The corpus comprised 4,289 recommendations extracted from audit reports selected according to audit closure dates between January 1, 2023, and July 31, 2025. The study employed content analysis supported by large language models (LLMs), combining automa</w:t>
       </w:r>
       <w:r>
         <w:rPr>
-          <w:color w:val="000000" w:themeColor="text1"/>
-          <w:lang w:val="en-US"/>
+          <w:rFonts w:ascii="Cambria" w:hAnsi="Cambria" w:eastAsia="Cambria" w:cs="Cambria"/>
+          <w:color w:val="000000"/>
+          <w:sz w:val="22"/>
+          <w:u w:val="none"/>
         </w:rPr>
-        <w:t xml:space="preserve"> (IIA), which distinguishes recommendations aimed at the causes of identified problems from those centered on the observed condition. The resear</w:t>
+        <w:t xml:space="preserve">ted coding of the recommendations with a subsequent critical analysis of the classifications produced, under researcher supervision in parameter definition, protocol development and refinement, and interpretation of the results. In addition, non-convergenc</w:t>
       </w:r>
       <w:r>
         <w:rPr>
-          <w:color w:val="000000" w:themeColor="text1"/>
-          <w:lang w:val="en-US"/>
+          <w:rFonts w:ascii="Cambria" w:hAnsi="Cambria" w:eastAsia="Cambria" w:cs="Cambria"/>
+          <w:color w:val="000000"/>
+          <w:sz w:val="22"/>
+          <w:u w:val="none"/>
         </w:rPr>
-        <w:t xml:space="preserve">c</w:t>
+        <w:t xml:space="preserve">es related to the “lasting effects” criterion were subjected to collection-driven categorization. In the final coding, 62.28% of the recommendations were classified simultaneously as cause-focused and associated with lasting effects, while a substantial sh</w:t>
       </w:r>
       <w:r>
         <w:rPr>
-          <w:color w:val="000000" w:themeColor="text1"/>
-          <w:lang w:val="en-US"/>
+          <w:rFonts w:ascii="Cambria" w:hAnsi="Cambria" w:eastAsia="Cambria" w:cs="Cambria"/>
+          <w:color w:val="000000"/>
+          <w:sz w:val="22"/>
+          <w:u w:val="none"/>
         </w:rPr>
-        <w:t xml:space="preserve">h employs a hybrid methodological approach in which a large language model (LLM) was used as a supporting instrument for examining the content of the recommendations, encompassing both automated coding and the subsequent critical analysis of the classifica</w:t>
+        <w:t xml:space="preserve">are of the corpus remained without an identified causal focus. The critical analysis, however, revealed greater stability in identifying causal focus than in assessing lasting effects, warranting caution in asserting the unequivocal predominance of either </w:t>
       </w:r>
       <w:r>
         <w:rPr>
-          <w:color w:val="000000" w:themeColor="text1"/>
-          <w:lang w:val="en-US"/>
+          <w:rFonts w:ascii="Cambria" w:hAnsi="Cambria" w:eastAsia="Cambria" w:cs="Cambria"/>
+          <w:color w:val="000000"/>
+          <w:sz w:val="22"/>
+          <w:u w:val="none"/>
         </w:rPr>
-        <w:t xml:space="preserve">t</w:t>
+        <w:t xml:space="preserve">orientation. The qualitative examination of non-convergences showed that instability regarding lasting effects was associated mainly with dependence on continued implementation and with the combination of actions of different scopes within a single recomme</w:t>
       </w:r>
       <w:r>
         <w:rPr>
-          <w:color w:val="000000" w:themeColor="text1"/>
-          <w:lang w:val="en-US"/>
+          <w:rFonts w:ascii="Cambria" w:hAnsi="Cambria" w:eastAsia="Cambria" w:cs="Cambria"/>
+          <w:color w:val="000000"/>
+          <w:sz w:val="22"/>
+          <w:u w:val="none"/>
         </w:rPr>
-        <w:t xml:space="preserve">ions produced. Researcher supervision guided parameter definition, protocol development and refinement, and the interpretation of results, without treating agreement between automated stages as a form of independent validation. The findings reveal the coex</w:t>
+        <w:t xml:space="preserve">ndation. The results therefore reveal a heterogeneous repertoire of recommendations in which measures aimed at correction and stabilization coexist with interventions directed at the causes of problems and potentially capable of fostering gradual processes</w:t>
       </w:r>
       <w:r>
         <w:rPr>
-          <w:color w:val="000000" w:themeColor="text1"/>
-          <w:lang w:val="en-US"/>
+          <w:rFonts w:ascii="Cambria" w:hAnsi="Cambria" w:eastAsia="Cambria" w:cs="Cambria"/>
+          <w:color w:val="000000"/>
+          <w:sz w:val="22"/>
+          <w:u w:val="none"/>
         </w:rPr>
-        <w:t xml:space="preserve">i</w:t>
+        <w:t xml:space="preserve"> of institutional improvement. In light of institutionalist and neo-institutionalist perspectives, these orientations are understood as potentially complementary, without the documentary evidence allowing claims about the actual implementation of the measu</w:t>
       </w:r>
       <w:r>
         <w:rPr>
-          <w:color w:val="000000" w:themeColor="text1"/>
-          <w:lang w:val="en-US"/>
+          <w:rFonts w:ascii="Cambria" w:hAnsi="Cambria" w:eastAsia="Cambria" w:cs="Cambria"/>
+          <w:color w:val="000000"/>
+          <w:sz w:val="22"/>
+          <w:u w:val="none"/>
         </w:rPr>
-        <w:t xml:space="preserve">stence of distinct and potentially complementary orientations: a substantial share of the recommendations displays characteristics associated with addressing the causes of problems, while another share is directed toward correcting operational nonconformit</w:t>
+        <w:t xml:space="preserve">res or the effective occurrence of institutional change. The dissertation contributes to the debate on government auditing in health by providing empirical, analytical, and methodological grounds for understanding the different orientations present in DENA</w:t>
       </w:r>
       <w:r>
         <w:rPr>
-          <w:color w:val="000000" w:themeColor="text1"/>
-          <w:lang w:val="en-US"/>
+          <w:rFonts w:ascii="Cambria" w:hAnsi="Cambria" w:eastAsia="Cambria" w:cs="Cambria"/>
+          <w:color w:val="000000"/>
+          <w:sz w:val="22"/>
+          <w:u w:val="none"/>
         </w:rPr>
-        <w:t xml:space="preserve">i</w:t>
-      </w:r>
-      <w:r>
-        <w:rPr>
-          <w:color w:val="000000" w:themeColor="text1"/>
-          <w:lang w:val="en-US"/>
-        </w:rPr>
-        <w:t xml:space="preserve">es, restoring compliance, and responding to more immediate demands. The critical analysis, however, revealed greater instability in the assessment of lasting effects, warranting caution in asserting the unequivocal predominance of either orientation. In li</w:t>
-      </w:r>
-      <w:r>
-        <w:rPr>
-          <w:color w:val="000000" w:themeColor="text1"/>
-          <w:lang w:val="en-US"/>
-        </w:rPr>
-        <w:t xml:space="preserve">g</w:t>
-      </w:r>
-      <w:r>
-        <w:rPr>
-          <w:color w:val="000000" w:themeColor="text1"/>
-          <w:lang w:val="en-US"/>
-        </w:rPr>
-        <w:t xml:space="preserve">ht of institutionalist and neo-institutionalist perspectives, the results make it possible to understand DENASUS’s recommendation activity as combining functions of correction, stabilization, and improvement, some of which have the potential to foster grad</w:t>
-      </w:r>
-      <w:r>
-        <w:rPr>
-          <w:color w:val="000000" w:themeColor="text1"/>
-          <w:lang w:val="en-US"/>
-        </w:rPr>
-        <w:t xml:space="preserve">u</w:t>
-      </w:r>
-      <w:r>
-        <w:rPr>
-          <w:color w:val="000000" w:themeColor="text1"/>
-          <w:lang w:val="en-US"/>
-        </w:rPr>
-        <w:t xml:space="preserve">al processes of institutional change. The dissertation contributes to the debate on the role of government auditing in improving public health policies by highlighting the different ways in which audit recommendations may guide management practices and by </w:t>
-      </w:r>
-      <w:r>
-        <w:rPr>
-          <w:color w:val="000000" w:themeColor="text1"/>
-          <w:lang w:val="en-US"/>
-        </w:rPr>
-        <w:t xml:space="preserve">offering analytical inputs for strengthening governance in the public sector.</w:t>
+        <w:t xml:space="preserve">SUS recommendations, examining the usefulness of the cause/condition typology, and exploring the use of language models in large-scale content analysis, thereby enriching reflection on the role of audit activity in SUS governance.</w:t>
       </w:r>
       <w:r>
         <w:rPr>
@@ -3862,14 +3874,17 @@
       </w:r>
       <w:r>
         <w:rPr>
-          <w:color w:val="000000" w:themeColor="text1"/>
-          <w:lang w:val="en-US"/>
+          <w:rFonts w:ascii="Cambria" w:hAnsi="Cambria" w:eastAsia="Cambria" w:cs="Cambria"/>
+          <w:color w:val="000000"/>
+          <w:sz w:val="22"/>
+          <w:u w:val="none"/>
         </w:rPr>
-        <w:t xml:space="preserve">Government auditing. DENASUS. Unified Health System. Institutional change.</w:t>
+        <w:t xml:space="preserve">government auditing; DENASUS; Unified Health System; institutional change.</w:t>
       </w:r>
       <w:r>
         <w:rPr>
           <w:color w:val="000000" w:themeColor="text1"/>
+          <w:lang w:val="en-US"/>
         </w:rPr>
       </w:r>
       <w:r>

</xml_diff>